<commit_message>
Part1: scene composition and rough animation is done.
</commit_message>
<xml_diff>
--- a/Voice Script.docx
+++ b/Voice Script.docx
@@ -79,202 +79,192 @@
       <w:pPr>
         <w:spacing w:line="276" w:lineRule="auto"/>
         <w:rPr>
-          <w:lang w:val="en-US"/>
-        </w:rPr>
-      </w:pPr>
-      <w:r>
-        <w:rPr>
-          <w:lang w:val="en-US"/>
-        </w:rPr>
-        <w:t xml:space="preserve">The </w:t>
-      </w:r>
-      <w:r>
-        <w:rPr>
           <w:b/>
           <w:bCs/>
           <w:lang w:val="en-US"/>
         </w:rPr>
-        <w:t>most useful material in the world</w:t>
-      </w:r>
-      <w:r>
-        <w:rPr>
-          <w:lang w:val="en-US"/>
-        </w:rPr>
-        <w:t xml:space="preserve">. </w:t>
-      </w:r>
-    </w:p>
-    <w:p>
-      <w:pPr>
-        <w:spacing w:line="276" w:lineRule="auto"/>
-        <w:rPr>
-          <w:lang w:val="en-US"/>
-        </w:rPr>
-      </w:pPr>
-      <w:r>
-        <w:rPr>
-          <w:lang w:val="en-US"/>
-        </w:rPr>
-        <w:t>You can find me everywhere.</w:t>
-      </w:r>
-    </w:p>
-    <w:p>
-      <w:pPr>
-        <w:spacing w:line="276" w:lineRule="auto"/>
-        <w:rPr>
-          <w:lang w:val="en-US"/>
-        </w:rPr>
-      </w:pPr>
-      <w:r>
-        <w:rPr>
-          <w:lang w:val="en-US"/>
-        </w:rPr>
-        <w:t>In your classroom,</w:t>
-      </w:r>
-    </w:p>
-    <w:p>
-      <w:pPr>
-        <w:spacing w:line="276" w:lineRule="auto"/>
-        <w:rPr>
-          <w:lang w:val="en-US"/>
-        </w:rPr>
-      </w:pPr>
-      <w:r>
-        <w:rPr>
-          <w:lang w:val="en-US"/>
-        </w:rPr>
-        <w:t>At the park,</w:t>
-      </w:r>
-    </w:p>
-    <w:p>
-      <w:pPr>
-        <w:spacing w:line="276" w:lineRule="auto"/>
-        <w:rPr>
-          <w:lang w:val="en-US"/>
-        </w:rPr>
-      </w:pPr>
-      <w:r>
-        <w:rPr>
-          <w:lang w:val="en-US"/>
-        </w:rPr>
-        <w:t>In the supermarket,</w:t>
-      </w:r>
-    </w:p>
-    <w:p>
-      <w:pPr>
-        <w:spacing w:line="276" w:lineRule="auto"/>
-        <w:rPr>
-          <w:lang w:val="en-US"/>
-        </w:rPr>
-      </w:pPr>
-      <w:r>
-        <w:rPr>
-          <w:lang w:val="en-US"/>
-        </w:rPr>
-        <w:t>Even, in your bathroom.</w:t>
-      </w:r>
-    </w:p>
-    <w:p>
-      <w:pPr>
-        <w:spacing w:line="276" w:lineRule="auto"/>
-        <w:rPr>
-          <w:lang w:val="en-US"/>
-        </w:rPr>
-      </w:pPr>
-      <w:r>
-        <w:rPr>
-          <w:lang w:val="en-US"/>
-        </w:rPr>
-        <w:t>You must be thinking who made me?</w:t>
-      </w:r>
-    </w:p>
-    <w:p>
-      <w:pPr>
-        <w:spacing w:line="276" w:lineRule="auto"/>
-        <w:rPr>
-          <w:lang w:val="en-US"/>
-        </w:rPr>
-      </w:pPr>
-      <w:r>
-        <w:rPr>
-          <w:lang w:val="en-US"/>
-        </w:rPr>
-        <w:t xml:space="preserve">I am Human-made. </w:t>
-      </w:r>
-    </w:p>
-    <w:p>
-      <w:pPr>
-        <w:spacing w:line="276" w:lineRule="auto"/>
-        <w:rPr>
-          <w:lang w:val="en-US"/>
-        </w:rPr>
-      </w:pPr>
-      <w:r>
-        <w:rPr>
-          <w:lang w:val="en-US"/>
-        </w:rPr>
-        <w:t>Then, I am molded and become many things.</w:t>
-      </w:r>
-    </w:p>
-    <w:p>
-      <w:pPr>
-        <w:spacing w:line="276" w:lineRule="auto"/>
-        <w:rPr>
-          <w:lang w:val="en-US"/>
-        </w:rPr>
-      </w:pPr>
-    </w:p>
-    <w:p>
-      <w:pPr>
-        <w:rPr>
-          <w:sz w:val="28"/>
-          <w:szCs w:val="24"/>
-          <w:lang w:val="en-US"/>
-        </w:rPr>
-      </w:pPr>
-      <w:r>
-        <w:rPr>
-          <w:sz w:val="28"/>
-          <w:szCs w:val="24"/>
-          <w:lang w:val="en-US"/>
-        </w:rPr>
-        <w:t>(</w:t>
-      </w:r>
-      <w:r>
-        <w:rPr>
-          <w:sz w:val="28"/>
-          <w:szCs w:val="24"/>
-          <w:lang w:val="en-US"/>
-        </w:rPr>
-        <w:t xml:space="preserve">Part I: </w:t>
-      </w:r>
-      <w:r>
-        <w:rPr>
-          <w:sz w:val="28"/>
-          <w:szCs w:val="24"/>
-          <w:lang w:val="en-US"/>
-        </w:rPr>
-        <w:t xml:space="preserve">This </w:t>
-      </w:r>
-      <w:r>
-        <w:rPr>
-          <w:sz w:val="28"/>
-          <w:szCs w:val="24"/>
-          <w:lang w:val="en-US"/>
-        </w:rPr>
-        <w:t xml:space="preserve">is </w:t>
-      </w:r>
-      <w:r>
-        <w:rPr>
-          <w:sz w:val="28"/>
-          <w:szCs w:val="24"/>
-          <w:lang w:val="en-US"/>
-        </w:rPr>
-        <w:t xml:space="preserve">the first section of the video, where the plastic is introduced through the character, </w:t>
-      </w:r>
+      </w:pPr>
       <w:r>
         <w:rPr>
           <w:b/>
           <w:bCs/>
+          <w:lang w:val="en-US"/>
+        </w:rPr>
+        <w:t>I am everywhere in the world.</w:t>
+      </w:r>
+    </w:p>
+    <w:p>
+      <w:pPr>
+        <w:spacing w:line="276" w:lineRule="auto"/>
+        <w:rPr>
+          <w:lang w:val="en-US"/>
+        </w:rPr>
+      </w:pPr>
+      <w:r>
+        <w:rPr>
+          <w:lang w:val="en-US"/>
+        </w:rPr>
+        <w:t>You can find me everywhere.</w:t>
+      </w:r>
+    </w:p>
+    <w:p>
+      <w:pPr>
+        <w:spacing w:line="276" w:lineRule="auto"/>
+        <w:rPr>
+          <w:lang w:val="en-US"/>
+        </w:rPr>
+      </w:pPr>
+      <w:r>
+        <w:rPr>
+          <w:lang w:val="en-US"/>
+        </w:rPr>
+        <w:t>In your classroom,</w:t>
+      </w:r>
+    </w:p>
+    <w:p>
+      <w:pPr>
+        <w:spacing w:line="276" w:lineRule="auto"/>
+        <w:rPr>
+          <w:lang w:val="en-US"/>
+        </w:rPr>
+      </w:pPr>
+      <w:r>
+        <w:rPr>
+          <w:lang w:val="en-US"/>
+        </w:rPr>
+        <w:t>At the park,</w:t>
+      </w:r>
+    </w:p>
+    <w:p>
+      <w:pPr>
+        <w:spacing w:line="276" w:lineRule="auto"/>
+        <w:rPr>
+          <w:lang w:val="en-US"/>
+        </w:rPr>
+      </w:pPr>
+      <w:r>
+        <w:rPr>
+          <w:lang w:val="en-US"/>
+        </w:rPr>
+        <w:t>In the supermarket,</w:t>
+      </w:r>
+    </w:p>
+    <w:p>
+      <w:pPr>
+        <w:spacing w:line="276" w:lineRule="auto"/>
+        <w:rPr>
+          <w:lang w:val="en-US"/>
+        </w:rPr>
+      </w:pPr>
+      <w:r>
+        <w:rPr>
+          <w:lang w:val="en-US"/>
+        </w:rPr>
+        <w:t>Even, in your bathroom.</w:t>
+      </w:r>
+    </w:p>
+    <w:p>
+      <w:pPr>
+        <w:spacing w:line="276" w:lineRule="auto"/>
+        <w:rPr>
+          <w:lang w:val="en-US"/>
+        </w:rPr>
+      </w:pPr>
+      <w:r>
+        <w:rPr>
+          <w:lang w:val="en-US"/>
+        </w:rPr>
+        <w:t>You must be thinking who made me?</w:t>
+      </w:r>
+    </w:p>
+    <w:p>
+      <w:pPr>
+        <w:spacing w:line="276" w:lineRule="auto"/>
+        <w:rPr>
+          <w:lang w:val="en-US"/>
+        </w:rPr>
+      </w:pPr>
+      <w:r>
+        <w:rPr>
+          <w:lang w:val="en-US"/>
+        </w:rPr>
+        <w:t xml:space="preserve">I am Human-made. </w:t>
+      </w:r>
+    </w:p>
+    <w:p>
+      <w:pPr>
+        <w:spacing w:line="276" w:lineRule="auto"/>
+        <w:rPr>
+          <w:lang w:val="en-US"/>
+        </w:rPr>
+      </w:pPr>
+      <w:r>
+        <w:rPr>
+          <w:lang w:val="en-US"/>
+        </w:rPr>
+        <w:t>Then, I am molded and become many things.</w:t>
+      </w:r>
+    </w:p>
+    <w:p>
+      <w:pPr>
+        <w:spacing w:line="276" w:lineRule="auto"/>
+        <w:rPr>
+          <w:lang w:val="en-US"/>
+        </w:rPr>
+      </w:pPr>
+    </w:p>
+    <w:p>
+      <w:pPr>
+        <w:rPr>
+          <w:sz w:val="28"/>
+          <w:szCs w:val="24"/>
+          <w:lang w:val="en-US"/>
+        </w:rPr>
+      </w:pPr>
+      <w:r>
+        <w:rPr>
+          <w:sz w:val="28"/>
+          <w:szCs w:val="24"/>
+          <w:lang w:val="en-US"/>
+        </w:rPr>
+        <w:t>(</w:t>
+      </w:r>
+      <w:r>
+        <w:rPr>
+          <w:sz w:val="28"/>
+          <w:szCs w:val="24"/>
+          <w:lang w:val="en-US"/>
+        </w:rPr>
+        <w:t xml:space="preserve">Part I: </w:t>
+      </w:r>
+      <w:r>
+        <w:rPr>
+          <w:sz w:val="28"/>
+          <w:szCs w:val="24"/>
+          <w:lang w:val="en-US"/>
+        </w:rPr>
+        <w:t xml:space="preserve">This </w:t>
+      </w:r>
+      <w:r>
+        <w:rPr>
+          <w:sz w:val="28"/>
+          <w:szCs w:val="24"/>
+          <w:lang w:val="en-US"/>
+        </w:rPr>
+        <w:t xml:space="preserve">is </w:t>
+      </w:r>
+      <w:r>
+        <w:rPr>
+          <w:sz w:val="28"/>
+          <w:szCs w:val="24"/>
+          <w:lang w:val="en-US"/>
+        </w:rPr>
+        <w:t xml:space="preserve">the first section of the video, where the plastic is introduced through the character, </w:t>
+      </w:r>
+      <w:r>
+        <w:rPr>
+          <w:b/>
+          <w:bCs/>
           <w:sz w:val="28"/>
           <w:szCs w:val="24"/>
           <w:lang w:val="en-US"/>
@@ -441,23 +431,7 @@
           <w:szCs w:val="24"/>
           <w:lang w:val="en-US"/>
         </w:rPr>
-        <w:t xml:space="preserve">Part </w:t>
-      </w:r>
-      <w:r>
-        <w:rPr>
-          <w:sz w:val="28"/>
-          <w:szCs w:val="24"/>
-          <w:lang w:val="en-US"/>
-        </w:rPr>
-        <w:t>I</w:t>
-      </w:r>
-      <w:r>
-        <w:rPr>
-          <w:sz w:val="28"/>
-          <w:szCs w:val="24"/>
-          <w:lang w:val="en-US"/>
-        </w:rPr>
-        <w:t xml:space="preserve">I: </w:t>
+        <w:t xml:space="preserve">Part II: </w:t>
       </w:r>
       <w:r>
         <w:rPr>
@@ -658,23 +632,7 @@
           <w:szCs w:val="24"/>
           <w:lang w:val="en-US"/>
         </w:rPr>
-        <w:t>Part I</w:t>
-      </w:r>
-      <w:r>
-        <w:rPr>
-          <w:sz w:val="28"/>
-          <w:szCs w:val="24"/>
-          <w:lang w:val="en-US"/>
-        </w:rPr>
-        <w:t>I</w:t>
-      </w:r>
-      <w:r>
-        <w:rPr>
-          <w:sz w:val="28"/>
-          <w:szCs w:val="24"/>
-          <w:lang w:val="en-US"/>
-        </w:rPr>
-        <w:t xml:space="preserve">I: </w:t>
+        <w:t xml:space="preserve">Part III: </w:t>
       </w:r>
       <w:r>
         <w:rPr>
@@ -706,15 +664,7 @@
           <w:szCs w:val="24"/>
           <w:lang w:val="en-US"/>
         </w:rPr>
-        <w:t>Third</w:t>
-      </w:r>
-      <w:r>
-        <w:rPr>
-          <w:sz w:val="28"/>
-          <w:szCs w:val="24"/>
-          <w:lang w:val="en-US"/>
-        </w:rPr>
-        <w:t xml:space="preserve"> s</w:t>
+        <w:t>Third s</w:t>
       </w:r>
       <w:r>
         <w:rPr>
@@ -964,23 +914,7 @@
           <w:szCs w:val="24"/>
           <w:lang w:val="en-US"/>
         </w:rPr>
-        <w:t>Part I</w:t>
-      </w:r>
-      <w:r>
-        <w:rPr>
-          <w:sz w:val="28"/>
-          <w:szCs w:val="24"/>
-          <w:lang w:val="en-US"/>
-        </w:rPr>
-        <w:t>V</w:t>
-      </w:r>
-      <w:r>
-        <w:rPr>
-          <w:sz w:val="28"/>
-          <w:szCs w:val="24"/>
-          <w:lang w:val="en-US"/>
-        </w:rPr>
-        <w:t xml:space="preserve">: </w:t>
+        <w:t xml:space="preserve">Part IV: </w:t>
       </w:r>
       <w:r>
         <w:rPr>

</xml_diff>